<commit_message>
fix(export): rename PDF placeholders to *.print.html; test(export): assert cover/page-break/caption parity; docs(w12): relabel PDF and paste raw build log
</commit_message>
<xml_diff>
--- a/Design/Reports/Month3/W12/samples/internship-report.docx
+++ b/Design/Reports/Month3/W12/samples/internship-report.docx
@@ -4,8 +4,19 @@
   <w:body>
     <w:p>
       <w:pPr>
-        <w:spacing w:before="1440"/>
-      </w:pPr>
+        <w:spacing w:after="120" w:before="240"/>
+        <w:jc w:val="center"/>
+      </w:pPr>
+      <w:r>
+        <w:rPr>
+          <w:rFonts w:ascii="Times New Roman" w:cs="Times New Roman" w:eastAsia="Times New Roman" w:hAnsi="Times New Roman"/>
+          <w:b/>
+          <w:bCs/>
+          <w:sz w:val="32"/>
+          <w:szCs w:val="32"/>
+        </w:rPr>
+        <w:t xml:space="preserve">TRƯỜNG ĐẠI HỌC BÁCH KHOA HÀ NỘI</w:t>
+      </w:r>
     </w:p>
     <w:p>
       <w:pPr>
@@ -17,16 +28,125 @@
           <w:rFonts w:ascii="Times New Roman" w:cs="Times New Roman" w:eastAsia="Times New Roman" w:hAnsi="Times New Roman"/>
           <w:b/>
           <w:bCs/>
+          <w:sz w:val="24"/>
+          <w:szCs w:val="24"/>
+        </w:rPr>
+        <w:t xml:space="preserve">————————————</w:t>
+      </w:r>
+    </w:p>
+    <w:p>
+      <w:pPr>
+        <w:spacing w:before="1440"/>
+      </w:pPr>
+    </w:p>
+    <w:p>
+      <w:pPr>
+        <w:spacing w:after="720"/>
+        <w:jc w:val="center"/>
+      </w:pPr>
+      <w:r>
+        <w:rPr>
+          <w:rFonts w:ascii="Times New Roman" w:cs="Times New Roman" w:eastAsia="Times New Roman" w:hAnsi="Times New Roman"/>
+          <w:b/>
+          <w:bCs/>
           <w:sz w:val="48"/>
           <w:szCs w:val="48"/>
         </w:rPr>
-        <w:t xml:space="preserve">BÁO CÁO THỰC TẬP</w:t>
+        <w:t xml:space="preserve">BÁO CÁO MẪU BÁO CÁO THỰC TẬP</w:t>
+      </w:r>
+    </w:p>
+    <w:p>
+      <w:pPr>
+        <w:spacing w:after="1440"/>
+        <w:jc w:val="center"/>
+      </w:pPr>
+      <w:r>
+        <w:rPr>
+          <w:rFonts w:ascii="Times New Roman" w:cs="Times New Roman" w:eastAsia="Times New Roman" w:hAnsi="Times New Roman"/>
+          <w:b/>
+          <w:bCs/>
+          <w:sz w:val="28"/>
+          <w:szCs w:val="28"/>
+        </w:rPr>
+        <w:t xml:space="preserve">Học phần: Kiểm thử Phần mềm nâng cao</w:t>
       </w:r>
     </w:p>
     <w:p>
       <w:pPr>
         <w:spacing w:before="1440"/>
       </w:pPr>
+    </w:p>
+    <w:p>
+      <w:pPr>
+        <w:spacing w:after="120"/>
+        <w:ind w:left="1440"/>
+        <w:jc w:val="left"/>
+      </w:pPr>
+      <w:r>
+        <w:rPr>
+          <w:rFonts w:ascii="Times New Roman" w:cs="Times New Roman" w:eastAsia="Times New Roman" w:hAnsi="Times New Roman"/>
+          <w:b/>
+          <w:bCs/>
+          <w:sz w:val="26"/>
+          <w:szCs w:val="26"/>
+        </w:rPr>
+        <w:t xml:space="preserve">Giảng viên hướng dẫn: </w:t>
+      </w:r>
+      <w:r>
+        <w:rPr>
+          <w:rFonts w:ascii="Times New Roman" w:cs="Times New Roman" w:eastAsia="Times New Roman" w:hAnsi="Times New Roman"/>
+          <w:sz w:val="26"/>
+          <w:szCs w:val="26"/>
+        </w:rPr>
+        <w:t xml:space="preserve">TS. Nguyễn Văn A</w:t>
+      </w:r>
+    </w:p>
+    <w:p>
+      <w:pPr>
+        <w:spacing w:after="120"/>
+        <w:ind w:left="1440"/>
+        <w:jc w:val="left"/>
+      </w:pPr>
+      <w:r>
+        <w:rPr>
+          <w:rFonts w:ascii="Times New Roman" w:cs="Times New Roman" w:eastAsia="Times New Roman" w:hAnsi="Times New Roman"/>
+          <w:b/>
+          <w:bCs/>
+          <w:sz w:val="26"/>
+          <w:szCs w:val="26"/>
+        </w:rPr>
+        <w:t xml:space="preserve">Thành viên thực hiện:</w:t>
+      </w:r>
+    </w:p>
+    <w:p>
+      <w:pPr>
+        <w:spacing w:after="120"/>
+        <w:ind w:left="1440"/>
+        <w:jc w:val="left"/>
+      </w:pPr>
+      <w:r>
+        <w:rPr>
+          <w:rFonts w:ascii="Times New Roman" w:cs="Times New Roman" w:eastAsia="Times New Roman" w:hAnsi="Times New Roman"/>
+          <w:sz w:val="26"/>
+          <w:szCs w:val="26"/>
+        </w:rPr>
+        <w:t xml:space="preserve">  • Nguyễn Văn An - 20261111</w:t>
+      </w:r>
+    </w:p>
+    <w:p>
+      <w:pPr>
+        <w:spacing w:after="1440"/>
+        <w:ind w:left="1440"/>
+        <w:jc w:val="left"/>
+      </w:pPr>
+      <w:r>
+        <w:rPr>
+          <w:rFonts w:ascii="Times New Roman" w:cs="Times New Roman" w:eastAsia="Times New Roman" w:hAnsi="Times New Roman"/>
+          <w:sz w:val="26"/>
+          <w:szCs w:val="26"/>
+        </w:rPr>
+        <w:t xml:space="preserve">  • Trần Thị Bình - 20262222</w:t>
+      </w:r>
     </w:p>
     <w:p>
       <w:pPr>
@@ -44,7 +164,7 @@
           <w:sz w:val="26"/>
           <w:szCs w:val="26"/>
         </w:rPr>
-        <w:t xml:space="preserve">25 tháng 6, 2026</w:t>
+        <w:t xml:space="preserve">25/06/2026</w:t>
       </w:r>
     </w:p>
     <w:p>
@@ -267,10 +387,86 @@
       <w:pPr>
         <w:spacing w:after="120"/>
       </w:pPr>
-      <w:r>
-        <w:t xml:space="preserve">Giới thiệu về doanh nghiệp, phòng ban thực tập, lĩnh vực hoạt động.</w:t>
-      </w:r>
-    </w:p>
+    </w:p>
+    <w:p>
+      <w:pPr>
+        <w:spacing w:after="120" w:before="120"/>
+        <w:jc w:val="center"/>
+      </w:pPr>
+      <w:r>
+        <w:t xml:space="preserve">Hình 1: Mô tả hình minh họa</w:t>
+      </w:r>
+    </w:p>
+    <w:p>
+      <w:pPr>
+        <w:spacing w:after="120" w:before="120"/>
+        <w:jc w:val="center"/>
+      </w:pPr>
+      <w:r>
+        <w:t xml:space="preserve">Bảng 1: Bảng dữ liệu mẫu kiểm thử</w:t>
+      </w:r>
+    </w:p>
+    <w:tbl>
+      <w:tblPr>
+        <w:tblW w:type="pct" w:w="100%"/>
+        <w:tblBorders>
+          <w:top w:val="single" w:color="000000" w:sz="1"/>
+          <w:left w:val="single" w:color="000000" w:sz="1"/>
+          <w:bottom w:val="single" w:color="000000" w:sz="1"/>
+          <w:right w:val="single" w:color="000000" w:sz="1"/>
+          <w:insideH w:val="single" w:color="000000" w:sz="1"/>
+          <w:insideV w:val="single" w:color="000000" w:sz="1"/>
+        </w:tblBorders>
+      </w:tblPr>
+      <w:tblGrid>
+        <w:gridCol w:w="100"/>
+        <w:gridCol w:w="100"/>
+      </w:tblGrid>
+      <w:tr>
+        <w:tc>
+          <w:tcPr>
+            <w:tcW w:type="pct" w:w="50%"/>
+          </w:tcPr>
+          <w:p>
+            <w:r>
+              <w:t xml:space="preserve">Cột 1</w:t>
+            </w:r>
+          </w:p>
+        </w:tc>
+        <w:tc>
+          <w:tcPr>
+            <w:tcW w:type="pct" w:w="50%"/>
+          </w:tcPr>
+          <w:p>
+            <w:r>
+              <w:t xml:space="preserve">Cột 2</w:t>
+            </w:r>
+          </w:p>
+        </w:tc>
+      </w:tr>
+      <w:tr>
+        <w:tc>
+          <w:tcPr>
+            <w:tcW w:type="pct" w:w="50%"/>
+          </w:tcPr>
+          <w:p>
+            <w:r>
+              <w:t xml:space="preserve">Giá trị A</w:t>
+            </w:r>
+          </w:p>
+        </w:tc>
+        <w:tc>
+          <w:tcPr>
+            <w:tcW w:type="pct" w:w="50%"/>
+          </w:tcPr>
+          <w:p>
+            <w:r>
+              <w:t xml:space="preserve">Giá trị B</w:t>
+            </w:r>
+          </w:p>
+        </w:tc>
+      </w:tr>
+    </w:tbl>
     <w:p>
       <w:r>
         <w:br w:type="page"/>

</xml_diff>